<commit_message>
sheet: Esdras, Arena Master
</commit_message>
<xml_diff>
--- a/Roteiro/Ficha_personagens.docx
+++ b/Roteiro/Ficha_personagens.docx
@@ -282,7 +282,11 @@
     </w:p>
     <w:p>
       <w:r>
-        <w:t>Idade:</w:t>
+        <w:t>Idade</w:t>
+      </w:r>
+      <w:proofErr w:type="gramStart"/>
+      <w:r>
+        <w:t>:</w:t>
       </w:r>
       <w:r>
         <w:t xml:space="preserve"> </w:t>
@@ -290,10 +294,15 @@
       <w:r>
         <w:t>???</w:t>
       </w:r>
-    </w:p>
-    <w:p>
-      <w:r>
-        <w:t>Sexo:</w:t>
+      <w:proofErr w:type="gramEnd"/>
+    </w:p>
+    <w:p>
+      <w:r>
+        <w:t>Sexo</w:t>
+      </w:r>
+      <w:proofErr w:type="gramStart"/>
+      <w:r>
+        <w:t>:</w:t>
       </w:r>
       <w:r>
         <w:t xml:space="preserve"> </w:t>
@@ -301,6 +310,7 @@
       <w:r>
         <w:t>???</w:t>
       </w:r>
+      <w:proofErr w:type="gramEnd"/>
     </w:p>
     <w:p>
       <w:r>
@@ -310,7 +320,15 @@
         <w:t xml:space="preserve"> Costuma aparecer</w:t>
       </w:r>
       <w:r>
-        <w:t xml:space="preserve"> como um corpo apodrecido usando um manto verde musgo e uma faixa cinza na cintura, portando a lanterna dos condenados e sua clássica foice. Pode aparecer com uma aparência fantasmagórica, com os braços esqueléticos expostos, um manto cinza, parecendo uma névoa, sua foice porém com uma aparência cósmica, e seu crânio rachado com restos de carne e pele apodrecidos.</w:t>
+        <w:t xml:space="preserve"> como um corpo apodrecido usando um manto verde musgo e uma faixa cinza na cintura, portando a lanterna dos condenados e sua clássica foice. Pode aparecer com uma aparência fantasmagórica, com os braços esqueléticos expostos, um manto cinza, parecendo uma névoa, </w:t>
+      </w:r>
+      <w:proofErr w:type="gramStart"/>
+      <w:r>
+        <w:t>sua foice</w:t>
+      </w:r>
+      <w:proofErr w:type="gramEnd"/>
+      <w:r>
+        <w:t xml:space="preserve"> porém com uma aparência cósmica, e seu crânio rachado com restos de carne e pele apodrecidos.</w:t>
       </w:r>
       <w:r>
         <w:t xml:space="preserve"> As vezes ela é um animal que fica observando os seres vivos.</w:t>
@@ -396,13 +414,66 @@
         <w:t>Background:</w:t>
       </w:r>
       <w:r>
-        <w:t xml:space="preserve"> A entidade que governa o mundos dos mortos, guia as almas para seus devidos locais de descanso, comando um exército para ajudar em seu trabalho, mas é caprichoso o suficiente para ir buscar pessoalmente algumas almas. Reside em uma região desconhecida entre os 4 mundos (céu, inferno, purgatório e mundo dos vivos), o lugar existe ao mesmo tempo que não, sua estrutura é desconhecida em grande parte, sendo somente citada como a torre das sombras. Quanto a sua aparência, ela se molda de acordo com os tempos, sua vontade e quem a vê. Seu poder e domínio já foi maior em algumas regiões em determinadas eras, assim como já teve muitos nomes, como Hela, Ceifador, Peste, Tânato, Ankou, Anubis, Yanlou Wang</w:t>
-      </w:r>
+        <w:t xml:space="preserve"> A entidade que governa </w:t>
+      </w:r>
+      <w:proofErr w:type="gramStart"/>
+      <w:r>
+        <w:t>o mundos</w:t>
+      </w:r>
+      <w:proofErr w:type="gramEnd"/>
+      <w:r>
+        <w:t xml:space="preserve"> dos mortos, guia as almas para seus devidos locais de descanso, comando um exército para ajudar em seu trabalho, mas é caprichoso o suficiente para ir buscar pessoalmente algumas almas. Reside em uma região desconhecida entre os 4 mundos (céu, inferno, purgatório e mundo dos vivos), o lugar existe ao mesmo tempo que não, sua estrutura é desconhecida em grande parte, sendo somente citada como a torre das sombras. Quanto a sua aparência, ela se molda de acordo com os tempos, sua vontade e quem a vê. Seu poder e domínio já foi maior em algumas regiões em determinadas eras, assim como já teve muitos nomes, como </w:t>
+      </w:r>
+      <w:proofErr w:type="spellStart"/>
+      <w:r>
+        <w:t>Hela</w:t>
+      </w:r>
+      <w:proofErr w:type="spellEnd"/>
+      <w:r>
+        <w:t xml:space="preserve">, Ceifador, Peste, </w:t>
+      </w:r>
+      <w:proofErr w:type="spellStart"/>
+      <w:r>
+        <w:t>Tânato</w:t>
+      </w:r>
+      <w:proofErr w:type="spellEnd"/>
       <w:r>
         <w:t xml:space="preserve">, </w:t>
       </w:r>
-      <w:r>
-        <w:t xml:space="preserve">Litch, </w:t>
+      <w:proofErr w:type="spellStart"/>
+      <w:r>
+        <w:t>Ankou</w:t>
+      </w:r>
+      <w:proofErr w:type="spellEnd"/>
+      <w:r>
+        <w:t xml:space="preserve">, </w:t>
+      </w:r>
+      <w:proofErr w:type="spellStart"/>
+      <w:r>
+        <w:t>Anubis</w:t>
+      </w:r>
+      <w:proofErr w:type="spellEnd"/>
+      <w:r>
+        <w:t xml:space="preserve">, </w:t>
+      </w:r>
+      <w:proofErr w:type="spellStart"/>
+      <w:r>
+        <w:t>Yanlou</w:t>
+      </w:r>
+      <w:proofErr w:type="spellEnd"/>
+      <w:r>
+        <w:t xml:space="preserve"> Wang</w:t>
+      </w:r>
+      <w:r>
+        <w:t xml:space="preserve">, </w:t>
+      </w:r>
+      <w:proofErr w:type="spellStart"/>
+      <w:r>
+        <w:t>Litch</w:t>
+      </w:r>
+      <w:proofErr w:type="spellEnd"/>
+      <w:r>
+        <w:t xml:space="preserve">, </w:t>
       </w:r>
       <w:r>
         <w:t>...</w:t>
@@ -555,8 +626,13 @@
       <w:r>
         <w:t xml:space="preserve"> </w:t>
       </w:r>
-      <w:r>
-        <w:t xml:space="preserve">Akemi </w:t>
+      <w:proofErr w:type="spellStart"/>
+      <w:r>
+        <w:t>Akemi</w:t>
+      </w:r>
+      <w:proofErr w:type="spellEnd"/>
+      <w:r>
+        <w:t xml:space="preserve"> </w:t>
       </w:r>
       <w:r>
         <w:t>Matsuyama</w:t>
@@ -595,7 +671,23 @@
         <w:t>, longos e preso</w:t>
       </w:r>
       <w:r>
-        <w:t>s, um olhar penetrante, usa um kimono e possui um cachimbo longo (kiseru).</w:t>
+        <w:t xml:space="preserve">s, um olhar penetrante, usa um </w:t>
+      </w:r>
+      <w:proofErr w:type="spellStart"/>
+      <w:r>
+        <w:t>kimono</w:t>
+      </w:r>
+      <w:proofErr w:type="spellEnd"/>
+      <w:r>
+        <w:t xml:space="preserve"> e possui um cachimbo longo (</w:t>
+      </w:r>
+      <w:proofErr w:type="spellStart"/>
+      <w:r>
+        <w:t>kiseru</w:t>
+      </w:r>
+      <w:proofErr w:type="spellEnd"/>
+      <w:r>
+        <w:t>).</w:t>
       </w:r>
     </w:p>
     <w:p>
@@ -756,7 +848,15 @@
         <w:t xml:space="preserve"> Milton</w:t>
       </w:r>
       <w:r>
-        <w:t xml:space="preserve"> Guaraciara da Silva</w:t>
+        <w:t xml:space="preserve"> </w:t>
+      </w:r>
+      <w:proofErr w:type="spellStart"/>
+      <w:r>
+        <w:t>Guaraciara</w:t>
+      </w:r>
+      <w:proofErr w:type="spellEnd"/>
+      <w:r>
+        <w:t xml:space="preserve"> da Silva</w:t>
       </w:r>
     </w:p>
     <w:p>
@@ -808,7 +908,15 @@
         <w:t xml:space="preserve"> Milton viveu a vida como um estudioso, velejava pelo mundo documentando tudo que encontrava, animais, culturas, estruturas arquitetônicas, folclore, história local, diário de bordo, etc. Enquanto estava em uma viagem pela Ásia, enquanto pesquisava sobre a Mongólia e outras culturas da região, seu barco naufragou e não pode terminar sua pesquisa</w:t>
       </w:r>
       <w:r>
-        <w:t>. A Morte concedeu a ele um ultimo desejo, ele poderia viver até finalizar sua pesquisa, em troca ele seria um servo da Morte e ficaria vagando entre os mundos documentando tudo que encontrar, até o fim dos tempos.</w:t>
+        <w:t xml:space="preserve">. A Morte concedeu a ele um </w:t>
+      </w:r>
+      <w:proofErr w:type="spellStart"/>
+      <w:r>
+        <w:t>ultimo</w:t>
+      </w:r>
+      <w:proofErr w:type="spellEnd"/>
+      <w:r>
+        <w:t xml:space="preserve"> desejo, ele poderia viver até finalizar sua pesquisa, em troca ele seria um servo da Morte e ficaria vagando entre os mundos documentando tudo que encontrar, até o fim dos tempos.</w:t>
       </w:r>
     </w:p>
     <w:p>
@@ -964,11 +1072,16 @@
     </w:p>
     <w:p>
       <w:r>
-        <w:t>Idade:</w:t>
+        <w:t>Idade</w:t>
+      </w:r>
+      <w:proofErr w:type="gramStart"/>
+      <w:r>
+        <w:t>:</w:t>
       </w:r>
       <w:r>
         <w:t xml:space="preserve"> ?</w:t>
       </w:r>
+      <w:proofErr w:type="gramEnd"/>
     </w:p>
     <w:p>
       <w:r>
@@ -996,10 +1109,108 @@
     </w:p>
     <w:p>
       <w:r>
-        <w:t>Background:</w:t>
-      </w:r>
-    </w:p>
-    <w:p>
+        <w:rPr>
+          <w:noProof/>
+        </w:rPr>
+        <w:drawing>
+          <wp:inline distT="0" distB="0" distL="0" distR="0" wp14:anchorId="24547836" wp14:editId="48026821">
+            <wp:extent cx="1742655" cy="2081429"/>
+            <wp:effectExtent l="0" t="0" r="0" b="0"/>
+            <wp:docPr id="593536278" name="Imagem 9"/>
+            <wp:cNvGraphicFramePr>
+              <a:graphicFrameLocks xmlns:a="http://schemas.openxmlformats.org/drawingml/2006/main" noChangeAspect="1"/>
+            </wp:cNvGraphicFramePr>
+            <a:graphic xmlns:a="http://schemas.openxmlformats.org/drawingml/2006/main">
+              <a:graphicData uri="http://schemas.openxmlformats.org/drawingml/2006/picture">
+                <pic:pic xmlns:pic="http://schemas.openxmlformats.org/drawingml/2006/picture">
+                  <pic:nvPicPr>
+                    <pic:cNvPr id="0" name="Picture 2"/>
+                    <pic:cNvPicPr>
+                      <a:picLocks noChangeAspect="1" noChangeArrowheads="1"/>
+                    </pic:cNvPicPr>
+                  </pic:nvPicPr>
+                  <pic:blipFill>
+                    <a:blip r:embed="rId14" cstate="print">
+                      <a:extLst>
+                        <a:ext uri="{28A0092B-C50C-407E-A947-70E740481C1C}">
+                          <a14:useLocalDpi xmlns:a14="http://schemas.microsoft.com/office/drawing/2010/main" val="0"/>
+                        </a:ext>
+                      </a:extLst>
+                    </a:blip>
+                    <a:srcRect/>
+                    <a:stretch>
+                      <a:fillRect/>
+                    </a:stretch>
+                  </pic:blipFill>
+                  <pic:spPr bwMode="auto">
+                    <a:xfrm>
+                      <a:off x="0" y="0"/>
+                      <a:ext cx="1746625" cy="2086171"/>
+                    </a:xfrm>
+                    <a:prstGeom prst="rect">
+                      <a:avLst/>
+                    </a:prstGeom>
+                    <a:noFill/>
+                  </pic:spPr>
+                </pic:pic>
+              </a:graphicData>
+            </a:graphic>
+          </wp:inline>
+        </w:drawing>
+      </w:r>
+      <w:r>
+        <w:rPr>
+          <w:noProof/>
+        </w:rPr>
+        <w:drawing>
+          <wp:inline distT="0" distB="0" distL="0" distR="0" wp14:anchorId="5841FA0F" wp14:editId="6F9BD334">
+            <wp:extent cx="3069453" cy="1726387"/>
+            <wp:effectExtent l="0" t="0" r="0" b="7620"/>
+            <wp:docPr id="1932187721" name="Imagem 10" descr="Ryse: Son of Rome Community Items · SteamDB"/>
+            <wp:cNvGraphicFramePr>
+              <a:graphicFrameLocks xmlns:a="http://schemas.openxmlformats.org/drawingml/2006/main" noChangeAspect="1"/>
+            </wp:cNvGraphicFramePr>
+            <a:graphic xmlns:a="http://schemas.openxmlformats.org/drawingml/2006/main">
+              <a:graphicData uri="http://schemas.openxmlformats.org/drawingml/2006/picture">
+                <pic:pic xmlns:pic="http://schemas.openxmlformats.org/drawingml/2006/picture">
+                  <pic:nvPicPr>
+                    <pic:cNvPr id="0" name="Picture 38" descr="Ryse: Son of Rome Community Items · SteamDB"/>
+                    <pic:cNvPicPr>
+                      <a:picLocks noChangeAspect="1" noChangeArrowheads="1"/>
+                    </pic:cNvPicPr>
+                  </pic:nvPicPr>
+                  <pic:blipFill>
+                    <a:blip r:embed="rId15" cstate="print">
+                      <a:extLst>
+                        <a:ext uri="{28A0092B-C50C-407E-A947-70E740481C1C}">
+                          <a14:useLocalDpi xmlns:a14="http://schemas.microsoft.com/office/drawing/2010/main" val="0"/>
+                        </a:ext>
+                      </a:extLst>
+                    </a:blip>
+                    <a:srcRect/>
+                    <a:stretch>
+                      <a:fillRect/>
+                    </a:stretch>
+                  </pic:blipFill>
+                  <pic:spPr bwMode="auto">
+                    <a:xfrm>
+                      <a:off x="0" y="0"/>
+                      <a:ext cx="3070930" cy="1727217"/>
+                    </a:xfrm>
+                    <a:prstGeom prst="rect">
+                      <a:avLst/>
+                    </a:prstGeom>
+                    <a:noFill/>
+                    <a:ln>
+                      <a:noFill/>
+                    </a:ln>
+                  </pic:spPr>
+                </pic:pic>
+              </a:graphicData>
+            </a:graphic>
+          </wp:inline>
+        </w:drawing>
+      </w:r>
       <w:r>
         <w:br w:type="page"/>
       </w:r>
@@ -1009,32 +1220,186 @@
         <w:lastRenderedPageBreak/>
         <w:t>Nome:</w:t>
       </w:r>
-    </w:p>
-    <w:p>
-      <w:r>
-        <w:t>Idade:</w:t>
-      </w:r>
+      <w:r>
+        <w:t xml:space="preserve"> Esdras</w:t>
+      </w:r>
+    </w:p>
+    <w:p>
+      <w:r>
+        <w:t>Idade</w:t>
+      </w:r>
+      <w:proofErr w:type="gramStart"/>
+      <w:r>
+        <w:t>:</w:t>
+      </w:r>
+      <w:r>
+        <w:t xml:space="preserve"> ?</w:t>
+      </w:r>
+      <w:proofErr w:type="gramEnd"/>
     </w:p>
     <w:p>
       <w:r>
         <w:t>Sexo:</w:t>
       </w:r>
+      <w:r>
+        <w:t xml:space="preserve"> M</w:t>
+      </w:r>
     </w:p>
     <w:p>
       <w:r>
         <w:t>Descrição Física:</w:t>
       </w:r>
+      <w:r>
+        <w:t xml:space="preserve"> Careca bombado de roupa social e avental de coração</w:t>
+      </w:r>
     </w:p>
     <w:p>
       <w:r>
         <w:t>Personalidade:</w:t>
       </w:r>
+      <w:r>
+        <w:t xml:space="preserve"> uma pessoa neutra, não se impõe em momento algum</w:t>
+      </w:r>
     </w:p>
     <w:p>
       <w:r>
         <w:t>Background:</w:t>
       </w:r>
-    </w:p>
+      <w:r>
+        <w:t xml:space="preserve"> Esdras é o subconsciente do Atlas manifestado como um barman que está ali apenas para ouvi-lo e ajuda-lo a evoluir na torre e causar reflexões.</w:t>
+      </w:r>
+    </w:p>
+    <w:p>
+      <w:pPr>
+        <w:rPr>
+          <w:noProof/>
+        </w:rPr>
+      </w:pPr>
+    </w:p>
+    <w:p>
+      <w:pPr>
+        <w:rPr>
+          <w:noProof/>
+        </w:rPr>
+      </w:pPr>
+      <w:r>
+        <w:rPr>
+          <w:noProof/>
+        </w:rPr>
+        <w:drawing>
+          <wp:inline distT="0" distB="0" distL="0" distR="0" wp14:anchorId="6B257550" wp14:editId="65BFCE14">
+            <wp:extent cx="2357478" cy="2494483"/>
+            <wp:effectExtent l="0" t="0" r="5080" b="1270"/>
+            <wp:docPr id="604017108" name="Imagem 3" descr="Katana ZERO (2019) by Askiisoft – @kosmaks on Tumblr"/>
+            <wp:cNvGraphicFramePr>
+              <a:graphicFrameLocks xmlns:a="http://schemas.openxmlformats.org/drawingml/2006/main" noChangeAspect="1"/>
+            </wp:cNvGraphicFramePr>
+            <a:graphic xmlns:a="http://schemas.openxmlformats.org/drawingml/2006/main">
+              <a:graphicData uri="http://schemas.openxmlformats.org/drawingml/2006/picture">
+                <pic:pic xmlns:pic="http://schemas.openxmlformats.org/drawingml/2006/picture">
+                  <pic:nvPicPr>
+                    <pic:cNvPr id="0" name="Picture 8" descr="Katana ZERO (2019) by Askiisoft – @kosmaks on Tumblr"/>
+                    <pic:cNvPicPr>
+                      <a:picLocks noChangeAspect="1" noChangeArrowheads="1"/>
+                    </pic:cNvPicPr>
+                  </pic:nvPicPr>
+                  <pic:blipFill rotWithShape="1">
+                    <a:blip r:embed="rId16">
+                      <a:extLst>
+                        <a:ext uri="{28A0092B-C50C-407E-A947-70E740481C1C}">
+                          <a14:useLocalDpi xmlns:a14="http://schemas.microsoft.com/office/drawing/2010/main" val="0"/>
+                        </a:ext>
+                      </a:extLst>
+                    </a:blip>
+                    <a:srcRect l="40538" t="46892" r="40114"/>
+                    <a:stretch>
+                      <a:fillRect/>
+                    </a:stretch>
+                  </pic:blipFill>
+                  <pic:spPr bwMode="auto">
+                    <a:xfrm>
+                      <a:off x="0" y="0"/>
+                      <a:ext cx="2361412" cy="2498645"/>
+                    </a:xfrm>
+                    <a:prstGeom prst="rect">
+                      <a:avLst/>
+                    </a:prstGeom>
+                    <a:noFill/>
+                    <a:ln>
+                      <a:noFill/>
+                    </a:ln>
+                    <a:extLst>
+                      <a:ext uri="{53640926-AAD7-44D8-BBD7-CCE9431645EC}">
+                        <a14:shadowObscured xmlns:a14="http://schemas.microsoft.com/office/drawing/2010/main"/>
+                      </a:ext>
+                    </a:extLst>
+                  </pic:spPr>
+                </pic:pic>
+              </a:graphicData>
+            </a:graphic>
+          </wp:inline>
+        </w:drawing>
+      </w:r>
+      <w:r>
+        <w:rPr>
+          <w:noProof/>
+        </w:rPr>
+        <w:drawing>
+          <wp:inline distT="0" distB="0" distL="0" distR="0" wp14:anchorId="306D4066" wp14:editId="38CD6BF4">
+            <wp:extent cx="1528876" cy="2209068"/>
+            <wp:effectExtent l="0" t="0" r="0" b="1270"/>
+            <wp:docPr id="2090810477" name="Imagem 6"/>
+            <wp:cNvGraphicFramePr>
+              <a:graphicFrameLocks xmlns:a="http://schemas.openxmlformats.org/drawingml/2006/main" noChangeAspect="1"/>
+            </wp:cNvGraphicFramePr>
+            <a:graphic xmlns:a="http://schemas.openxmlformats.org/drawingml/2006/main">
+              <a:graphicData uri="http://schemas.openxmlformats.org/drawingml/2006/picture">
+                <pic:pic xmlns:pic="http://schemas.openxmlformats.org/drawingml/2006/picture">
+                  <pic:nvPicPr>
+                    <pic:cNvPr id="0" name="Picture 20"/>
+                    <pic:cNvPicPr>
+                      <a:picLocks noChangeAspect="1" noChangeArrowheads="1"/>
+                    </pic:cNvPicPr>
+                  </pic:nvPicPr>
+                  <pic:blipFill rotWithShape="1">
+                    <a:blip r:embed="rId17" cstate="print">
+                      <a:extLst>
+                        <a:ext uri="{28A0092B-C50C-407E-A947-70E740481C1C}">
+                          <a14:useLocalDpi xmlns:a14="http://schemas.microsoft.com/office/drawing/2010/main" val="0"/>
+                        </a:ext>
+                      </a:extLst>
+                    </a:blip>
+                    <a:srcRect r="50510"/>
+                    <a:stretch>
+                      <a:fillRect/>
+                    </a:stretch>
+                  </pic:blipFill>
+                  <pic:spPr bwMode="auto">
+                    <a:xfrm>
+                      <a:off x="0" y="0"/>
+                      <a:ext cx="1531260" cy="2212513"/>
+                    </a:xfrm>
+                    <a:prstGeom prst="rect">
+                      <a:avLst/>
+                    </a:prstGeom>
+                    <a:noFill/>
+                    <a:ln>
+                      <a:noFill/>
+                    </a:ln>
+                    <a:extLst>
+                      <a:ext uri="{53640926-AAD7-44D8-BBD7-CCE9431645EC}">
+                        <a14:shadowObscured xmlns:a14="http://schemas.microsoft.com/office/drawing/2010/main"/>
+                      </a:ext>
+                    </a:extLst>
+                  </pic:spPr>
+                </pic:pic>
+              </a:graphicData>
+            </a:graphic>
+          </wp:inline>
+        </w:drawing>
+      </w:r>
+    </w:p>
+    <w:p/>
     <w:p>
       <w:r>
         <w:br w:type="page"/>

</xml_diff>